<commit_message>
Resync 28 published packets against a corpus-wide mtime staleness bug
A prior enrichment pass edited case.md across most published cases but
never rebuilt their docx/xlsx/html packets, so a live Tier 1 re-check
flagged 28 cases (of 39 that should be clean) as CONTINUITY STALE. Verified
each individually (content-hash match against MANIFEST, direct docx/xlsx/html
diff against current case.md, and a rendered-PDF read for facilitator-content
leaks) before touching anything: 27 were pure mtime noise with no real content
drift, and apron-order had one small real edit that needed an actual rebuild.
All 39 now pass a live Tier 1 re-check with 0 blockers.

Co-Authored-By: Claude Sonnet 5 <noreply@anthropic.com>
</commit_message>
<xml_diff>
--- a/cases/apron-order/published/Apron Order - Case Study.docx
+++ b/cases/apron-order/published/Apron Order - Case Study.docx
@@ -974,7 +974,7 @@
             <w:r>
               <w:t xml:space="preserve">Fabric Depot, "Bleached White Cotton Muslin Woven 25 YD Bolt Fabric" (</w:t>
             </w:r>
-            <w:hyperlink w:history="1" r:id="rId0fiy9wzyctvilt7d1jtak">
+            <w:hyperlink w:history="1" r:id="rIdmbd7pfv0tejzjzmxql17f">
               <w:r>
                 <w:rPr>
                   <w:rStyle w:val="Hyperlink"/>
@@ -1047,7 +1047,7 @@
             <w:r>
               <w:t xml:space="preserve">Wikipedia, "Seam allowance" (</w:t>
             </w:r>
-            <w:hyperlink w:history="1" r:id="rIdwa9pjddp28o9v0gr1p9kh">
+            <w:hyperlink w:history="1" r:id="rIdebqjg4txo_aifqt35uo2u">
               <w:r>
                 <w:rPr>
                   <w:rStyle w:val="Hyperlink"/>
@@ -1120,7 +1120,7 @@
             <w:r>
               <w:t xml:space="preserve">FreeSewing (</w:t>
             </w:r>
-            <w:hyperlink w:history="1" r:id="rIdtlo7kwtyanzyiflsb1ep6">
+            <w:hyperlink w:history="1" r:id="rIdmzxb_nxnt-rvtklstoh8n">
               <w:r>
                 <w:rPr>
                   <w:rStyle w:val="Hyperlink"/>
@@ -1446,7 +1446,7 @@
       <w:r>
         <w:t xml:space="preserve">- </w:t>
       </w:r>
-      <w:hyperlink w:history="1" r:id="rId4xnwigcbfh0bwi6eyvmk9">
+      <w:hyperlink w:history="1" r:id="rIdiztndv6hd7sdr2buhlh-l">
         <w:r>
           <w:rPr>
             <w:rStyle w:val="Hyperlink"/>
@@ -1465,7 +1465,7 @@
       <w:r>
         <w:t xml:space="preserve">- </w:t>
       </w:r>
-      <w:hyperlink w:history="1" r:id="rIdpal-a8rr83i4rgwpdsubq">
+      <w:hyperlink w:history="1" r:id="rIdpur27lpaqqhlfw3smkbni">
         <w:r>
           <w:rPr>
             <w:rStyle w:val="Hyperlink"/>
@@ -1484,7 +1484,7 @@
       <w:r>
         <w:t xml:space="preserve">- </w:t>
       </w:r>
-      <w:hyperlink w:history="1" r:id="rIdul5cjlqe0zyfbuwu4dj4a">
+      <w:hyperlink w:history="1" r:id="rId4azwwqojziueukrxz3jsp">
         <w:r>
           <w:rPr>
             <w:rStyle w:val="Hyperlink"/>
@@ -1503,7 +1503,7 @@
       <w:r>
         <w:t xml:space="preserve">- </w:t>
       </w:r>
-      <w:hyperlink w:history="1" r:id="rIduz0u9hswuixy3zldqifky">
+      <w:hyperlink w:history="1" r:id="rIdt_3hqmqo3hvewv2ki8rhk">
         <w:r>
           <w:rPr>
             <w:rStyle w:val="Hyperlink"/>

</xml_diff>